<commit_message>
paper: rev8 adds DOIs for references 28-29 (checked against Crossref)
</commit_message>
<xml_diff>
--- a/08_final_submission/ICIIT2027_Paper_rev8.docx
+++ b/08_final_submission/ICIIT2027_Paper_rev8.docx
@@ -14045,7 +14045,7 @@
         <w:pStyle w:val="Reference"/>
       </w:pPr>
       <w:r>
-        <w:t>[28]  S. Nahmias. 1994. Demand estimation in lost sales inventory systems. Naval Research Logistics 41, 6, 739–757.</w:t>
+        <w:t>[28]  S. Nahmias. 1994. Demand estimation in lost sales inventory systems. Naval Research Logistics 41, 6, 739–757. https://doi.org/10.1002/1520-6750(199410)41:6&lt;739::AID-NAV3220410605&gt;3.0.CO;2-A</w:t>
       </w:r>
     </w:p>
     <w:p>
@@ -14053,7 +14053,7 @@
         <w:pStyle w:val="Reference"/>
       </w:pPr>
       <w:r>
-        <w:t>[29]  J. L. Powell. 1986. Censored regression quantiles. Journal of Econometrics 32, 1, 143–155.</w:t>
+        <w:t>[29]  J. L. Powell. 1986. Censored regression quantiles. Journal of Econometrics 32, 1, 143–155. https://doi.org/10.1016/0304-4076(86)90016-3</w:t>
       </w:r>
     </w:p>
     <w:sectPr>

</xml_diff>